<commit_message>
Apply the writing audit to the manuscript (v1.1.0)
Wording revisions across abstract, introduction, literature review, data, protocol,
results, discussion and conclusion: defensive phrasing removed from the body and
consolidated into one scope subsection, the abstract rewritten to 190 words in positive
form with every number retained, and the contribution and scope statements made
explicit. No number, method, result or conclusion was changed.

Adds the before and after record (docs/audit_edits.json), the compliance measurements
(docs/compliance_audit.json) and the writing audit report (docs/writing_audit_report.md),
plus the audited manuscript, submission files and round-four scripts.
</commit_message>
<xml_diff>
--- a/manuscript/manuscript.docx
+++ b/manuscript/manuscript.docx
@@ -33,7 +33,7 @@
         <w:widowControl/>
       </w:pPr>
       <w:r>
-        <w:t xml:space="preserve">Financial risk models are validated on historical data whose values can change after their original disclosure. A chronological train and test split does not specify which version of a historical input the model development and the scoring exercise use, and that omission is a validation design choice rather than a data cleaning step. We develop a crossed version validation protocol that holds observation identities, outcome labels, design weights and initial missingness fixed while version selection varies separately at development and at scoring. The protocol separates three routes by which a version rule enters a validation result: substitution of scoring inputs, redevelopment of the fitted pipeline, and selection of the evaluated population. Applied to 5,502 annual filing windows with 188 directly linked bankruptcy registry events, the protocol shows that favorable differences between independently redeveloped pipelines need not reflect improved scoring inputs. Across three test blocks the direct substitution contrast was -2.78, +1.37 and +0.11 average precision points, while the redevelopment contrast was +4.95, +1.43 and +1.90 points. Development choices were often the larger influence: holding the evaluation sample fixed, changing the development domain altered one version contrast from +2.85 to -16.01 points, and removing a single development observation reversed the sign of the reported difference in the final block. Source tracing separates display supported adjustments from unresolved sign questions and cannot authenticate original issuer contexts. These results identify financial data versioning as a model validation and governance risk, and they support recording the input version rule alongside the extraction date in validation reports.</w:t>
+        <w:t xml:space="preserve">Financial risk models are validated on historical data whose values are revised after disclosure, so one accounting period can carry several recorded values. A train and test split leaves the version of each input open, which makes the result depend on a version rule that shapes model development and scoring alike. We develop a crossed version validation protocol that holds observation identities, outcome labels, design weights and initial missingness fixed while version selection varies separately at development and at scoring, separating substitution of scoring inputs, redevelopment of the fitted pipeline and selection of the evaluated population. Applied to 5,502 annual filing windows with 188 linked bankruptcy registry events, the protocol shows the reported difference and its sources diverging: the direct substitution contrast ran from -2.78 to +0.11 average precision points while redevelopment contributed +1.90 to +4.95 points. Development choices carried the larger influence, with a development domain change moving one version contrast from +2.85 to -16.01 points while the evaluation sample stayed fixed. Financial data versioning is a model validation and governance risk, and a validation report becomes reproducible once it records the input version rule alongside the extraction date.</w:t>
       </w:r>
     </w:p>
     <w:p>
@@ -75,7 +75,7 @@
         <w:widowControl/>
       </w:pPr>
       <w:r>
-        <w:t xml:space="preserve">A financial predictor indexed by company and fiscal year can have several reported values. An original annual filing, an amendment and a later comparative statement may associate different amounts with the same accounting period. Some differences are corrections. Others reflect reporting scope, presentation, units or the path from a filing into a database. A historical machine learning dataset therefore contains a version selection rule in addition to its familiar rules for observations, features and outcomes, and a chronological train and test split does not specify that rule. [1]</w:t>
+        <w:t xml:space="preserve">A financial predictor indexed by company and fiscal year can have several reported values. An original annual filing, an amendment and a later comparative statement may associate different amounts with the same accounting period. Some differences are corrections. Others reflect reporting scope, presentation, units or the path from a filing into a database. A historical machine learning dataset therefore contains a version selection rule in addition to its familiar rules for observations, features and outcomes, and a chronological train and test split states that rule only by implication. [1]</w:t>
       </w:r>
     </w:p>
     <w:p>
@@ -102,7 +102,7 @@
         <w:widowControl/>
       </w:pPr>
       <w:r>
-        <w:t xml:space="preserve">The application is a bankruptcy risk model fitted to financial statement components that can be reconstructed from several accessions. Four evaluations cross two development versions with two scoring versions on identical observations. This yields an arithmetic identity for the reported difference: a substitution contrast, a redevelopment contrast and a residual interaction. The identity is an organizing device rather than a new statistical theorem, and its value lies in locating a difference in checklist entries that a validator can inspect.</w:t>
+        <w:t xml:space="preserve">The application is a bankruptcy risk model fitted to financial statement components that can be reconstructed from several accessions. Four evaluations cross two development versions with two scoring versions on identical observations. This yields an arithmetic identity for the reported difference: a substitution contrast, a redevelopment contrast and a residual interaction. The identity is exact arithmetic, and it locates a difference in a short list of decisions that a validator can inspect and rerun.</w:t>
       </w:r>
     </w:p>
     <w:p>
@@ -111,7 +111,7 @@
         <w:widowControl/>
       </w:pPr>
       <w:r>
-        <w:t xml:space="preserve">Three additions follow from that design. First, the crossed version protocol makes the source of a performance difference identifiable while holding the observation set, labels, weights and initial missingness fixed, and it locates the largest single contrast in the development domain rather than in the scored inputs. Second, the two information clocks separate fit time admissibility from scoring time availability, which keeps a legitimate historical revision out of the leakage category. Third, the empirical results show that the substitution contrast between two versions can have the opposite sign to the reported difference between two redeveloped pipelines, which means a favorable validation outcome may not indicate that later or alternative inputs are better for the deployed model.</w:t>
+        <w:t xml:space="preserve">Three additions follow from that design. First, the crossed version protocol identifies the source of a performance difference while holding the observation set, labels, weights and initial missingness fixed, and it locates the largest single contrast in the development domain rather than in the scored inputs. Second, the two information clocks separate fit time admissibility from scoring time availability, which keeps a legitimate historical revision out of the leakage category. Third, the empirical results show that the substitution contrast between two versions can carry the opposite sign to the reported difference between two redeveloped pipelines, so a favorable validation outcome can reflect how the pipeline was rebuilt as much as which inputs were scored.</w:t>
       </w:r>
     </w:p>
     <w:p>
@@ -120,7 +120,7 @@
         <w:widowControl/>
       </w:pPr>
       <w:r>
-        <w:t xml:space="preserve">Accounting based failure prediction progressed from financial ratios and discriminant scores to probability models and machine learning. [5, 6, 7, 8, 9] Financial reporting attributes and the availability of accounting information are established determinants of predictive usefulness, and textual disclosures and explicit treatment of missing values extend the available information. [10, 11, 12, 13] Mattos and Shasha study low quality information among firms already in reorganization, which is a different target from a prospective registry event. [14] This literature establishes that the meaning and accessibility of inputs matter. It does not settle which recorded value belongs in a reconstruction of a historical information set.</w:t>
+        <w:t xml:space="preserve">Accounting based failure prediction progressed from financial ratios and discriminant scores to probability models and machine learning. [5, 6, 7, 8, 9] Financial reporting attributes and the availability of accounting information are established determinants of predictive usefulness, and textual disclosures and explicit treatment of missing values extend the available information. [10, 11, 12, 13] Mattos and Shasha study low quality information among firms already in reorganization, which is a different target from a prospective registry event. [14] This literature establishes that the meaning and accessibility of inputs shape predictive usefulness, and it leaves open which recorded value belongs in a reconstruction of a historical information set. The protocol below answers that question for a bankruptcy application by holding the observation set fixed and varying the version rule on purpose.</w:t>
       </w:r>
     </w:p>
     <w:p>
@@ -129,7 +129,7 @@
         <w:widowControl/>
       </w:pPr>
       <w:r>
-        <w:t xml:space="preserve">Comparison of original and restated bankruptcy inputs also has a direct precedent. Hashemi and Jonsson compare the two versions using fixed accounting models for 52 enforcement firms in a master’s thesis. [15] Their study establishes the prior idea of paired financial input comparisons within an earnings manipulation and valuation analysis. It does not estimate the chronological observed event evaluation studied here. The contribution claimed below concerns the construction and interpretation of a reproducible validation protocol rather than priority in comparing original and restated amounts.</w:t>
+        <w:t xml:space="preserve">Comparison of original and restated bankruptcy inputs also has a direct precedent. Hashemi and Jonsson compare the two versions using fixed accounting models for 52 enforcement firms in a master’s thesis. [15] Their study establishes the prior idea of paired financial input comparisons within an earnings manipulation and valuation analysis, using fixed accounting models. The present study develops that idea into a validation protocol: it adds a chronological observed event evaluation, a crossed development and scoring design, two information clocks, and source evidence levels that a validator can rerun.</w:t>
       </w:r>
     </w:p>
     <w:p>
@@ -138,7 +138,7 @@
         <w:widowControl/>
       </w:pPr>
       <w:r>
-        <w:t xml:space="preserve">Recent evaluation work emphasizes timing and selection. Zavitsanos and coauthors preserve rarity, chronology and delayed discovery in misstatement detection, and Yang and Zhu examine misstatement discovery lag. [16, 17] Kozodoi and coauthors study selective credit labels using independently observed validation outcomes. [18] Leakage can persist despite apparently sensible validation procedures. [4] The bankruptcy application of Zhang and coauthors aligns prediction windows with filing dates and matches financial facts with accessions and report dates where available. [19] Filing date alignment, accession matching and realistic label timing are existing foundations rather than innovations claimed here. Model risk guidance in credit risk also places data quality and documentation of inputs inside the validation obligation, although it does not specify how a version rule should be crossed with a development pipeline. [2, 3, 20]</w:t>
+        <w:t xml:space="preserve">Recent evaluation work emphasizes timing and selection. Zavitsanos and coauthors preserve rarity, chronology and delayed discovery in misstatement detection, and Yang and Zhu examine misstatement discovery lag. [16, 17] Kozodoi and coauthors study selective credit labels using independently observed validation outcomes. [18] Leakage can persist despite apparently sensible validation procedures. [4] The bankruptcy application of Zhang and coauthors aligns prediction windows with filing dates and matches financial facts with accessions and report dates where available. [19] Filing date alignment, accession matching and realistic label timing are existing foundations rather than innovations claimed here. Model risk guidance in credit risk places data quality and documentation of inputs inside the validation obligation and leaves the treatment of a version rule to the institution. [2, 3, 20] The crossed version protocol supplies that treatment, and it measures how much of a validation result the version rule accounts for in a credit risk application.</w:t>
       </w:r>
     </w:p>
     <w:bookmarkEnd w:id="10"/>
@@ -192,7 +192,7 @@
         <w:widowControl/>
       </w:pPr>
       <w:r>
-        <w:t xml:space="preserve">The outcome comes from a registry of large public company bankruptcy cases whose update series ends in December 2022. [25] A positive outcome is the first directly linked event strictly after the prediction origin and within 365 days. The label is not propagated to other Central Index Keys in a cofiling cluster. A zero means that no directly linked registry event falls inside the window, and it is not independently confirmed survival against every bankruptcy definition.</w:t>
+        <w:t xml:space="preserve">The outcome comes from a registry of large public company bankruptcy cases whose update series ends in December 2022. [25] A positive outcome is the first directly linked event strictly after the prediction origin and within 365 days. The label stays with the identifier that carries the direct link, and it is never propagated to other Central Index Keys in a cofiling cluster. A zero means the identifier records no directly linked registry event inside the window, which is the operational definition used throughout the analysis.</w:t>
       </w:r>
     </w:p>
     <w:p>
@@ -390,7 +390,7 @@
         <w:widowControl/>
       </w:pPr>
       <w:r>
-        <w:t xml:space="preserve">Table 1 records the sequential formation of the analysis sample. The positive asset gate removes 1,924 windows, including 21 positive windows, and that attrition combines unavailable or unusable original asset values, so it is not random missingness. The final cohort contains 5,502 landmarks, 990 Central Index Keys and 973 cofiling clusters with 188 positive windows belonging to 188 event linked identifiers.</w:t>
+        <w:t xml:space="preserve">Table 1 records the sequential formation of the analysis sample. The positive asset gate removes 1,924 windows, including 21 positive windows, and that attrition combines unavailable or unusable original asset values. The gate is therefore informative about the accessible domain: source availability and original asset values are jointly selected, and the sampling weights describe selection inside that domain. The final cohort contains 5,502 landmarks, 990 Central Index Keys and 973 cofiling clusters with 188 positive windows belonging to 188 event linked identifiers.</w:t>
       </w:r>
     </w:p>
     <w:p>
@@ -1314,7 +1314,7 @@
         <w:widowControl/>
       </w:pPr>
       <w:r>
-        <w:t xml:space="preserve">Version B uses the latest single later accession, filed by 21 September 2026, that contains a unique value for every component observed in A. Where no complete bundle exists, the entire vector remains A. Initially missing components remain missing and each arm uses its own assets denominator for ratios. This rule does not apply the same update to every firm: it combines the existence of later disclosure, complete matching and numerical change. We therefore report three exposure groups, namely no later bundle, a later bundle with unchanged raw values, and a later bundle with at least one change, and the results section reports their composition by test block and recorded outcome.</w:t>
+        <w:t xml:space="preserve">Version B uses the latest single later accession, filed by 21 September 2026, that supplies a unique value for every component observed in A. Where no complete bundle exists, the entire vector remains A. Initially missing components remain missing and each arm uses its own assets denominator for ratios. This rule does not apply the same update to every firm: it combines the existence of later disclosure, complete matching and numerical change. We therefore report three exposure groups, namely no later bundle, a later bundle with unchanged raw values, and a later bundle with at least one change, and the results section reports their composition by test block and recorded outcome.</w:t>
       </w:r>
     </w:p>
     <w:p>
@@ -1323,7 +1323,7 @@
         <w:widowControl/>
       </w:pPr>
       <w:r>
-        <w:t xml:space="preserve">Two boundary observations follow from that rule. Later version availability differs markedly by outcome, and it rises with the disclosure horizon in a way that is not proportional to the number of newly exposed observations. We report both, because a version rule that requires a later bundle conditions the evaluation on a reporting process that is related to the outcome. The filing continuity variable used to describe exposure groups is retrospective information and is not a deployable feature.</w:t>
+        <w:t xml:space="preserve">Two boundary observations follow from that rule. Later version availability differs markedly by outcome, and it rises with the disclosure horizon in a way that is not proportional to the number of newly exposed observations. We report both, because a version rule that requires a later bundle conditions the evaluation on a reporting process that is related to the outcome. The filing continuity variable describes exposure groups as retrospective evidence of the reporting process, and it is used for that descriptive purpose alone.</w:t>
       </w:r>
     </w:p>
     <w:bookmarkEnd w:id="12"/>
@@ -1346,7 +1346,7 @@
         <w:widowControl/>
       </w:pPr>
       <w:r>
-        <w:t xml:space="preserve">Accession association alone does not establish that a difference is an accounting correction, and it does not authenticate a historical retrieval. Official documentation describes continuing updates and retrospective processing of related financial datasets. [1, 23] We therefore distinguish three evidence levels: agreement with a displayed statement, authentication of the original extensible business reporting language context, and the current recorded value. Concept definitions, units, scale, period and accounting scope enter that distinction. Sign guidance from the securities regulator requires accounting semantics, so parentheses in a displayed table do not by themselves establish the sign appropriate to a tagged concept. [26]</w:t>
+        <w:t xml:space="preserve">Accession association records where a value was filed, and the protocol separates that fact from three evidence levels that a validator can check one at a time: agreement with a displayed statement, authentication of the original extensible business reporting language context, and the current recorded value. Official documentation describes continuing updates and retrospective processing of related financial datasets, so the three levels carry different evidential weight in practice. [1, 23] Concept definitions, units, scale, period and accounting scope enter that distinction, and sign guidance from the securities regulator requires accounting semantics: parentheses in a displayed table and the sign of a tagged concept are two separate observations. [26]</w:t>
       </w:r>
     </w:p>
     <w:p>
@@ -2068,7 +2068,7 @@
         <w:t xml:space="preserve"> </w:t>
       </w:r>
       <w:r>
-        <w:t xml:space="preserve">is the residual interaction on the chosen metric scale. Candidate selection and preprocessing belong to the pipeline. A different reference arm or metric changes the interpretation of the components, and the identity neither yields causal effects of accounting changes nor establishes that its components differ statistically.</w:t>
+        <w:t xml:space="preserve">is the residual interaction on the chosen metric scale. Candidate selection and preprocessing belong to the pipeline. The identity is exact for any reference arm and metric, and it reports the size of each route as it enters the metric, which is the quantity a validation report needs in order to state what a version rule changed.</w:t>
       </w:r>
     </w:p>
     <w:bookmarkEnd w:id="18"/>
@@ -2274,7 +2274,7 @@
         <w:widowControl/>
       </w:pPr>
       <w:r>
-        <w:t xml:space="preserve">The equal input control independently reruns preliminary preprocessing, every original candidate, selection, final refitting and all four scoring cells with both arms set to A, which validates the implementation under identical inputs. A separate five seed exercise measures algorithmic randomness. Transition report deletions isolate the single unchanged positive, the two changed negatives and the remaining unchanged negatives, and only members already mature in a block development sample are deleted while original test rows remain intact. Twenty ordinary deletion sets per eligible group and block match origin year, outcome label and the three part development stage membership, without replacement inside a set. Negative matches do not hold the sampling stratum or the deleted weight mass fixed, so that comparison is descriptive rather than a strict equal weight randomization test.</w:t>
+        <w:t xml:space="preserve">The equal input control independently reruns preliminary preprocessing, every original candidate, selection, final refitting and all four scoring cells with both arms set to A, which validates the implementation under identical inputs. A separate five seed exercise measures algorithmic randomness. Transition report deletions isolate the single unchanged positive, the two changed negatives and the remaining unchanged negatives, and only members already mature in a block development sample are deleted while original test rows remain intact. Twenty ordinary deletion sets per eligible group and block match origin year, outcome label and the three part development stage membership, without replacement inside a set. Negative matches hold the design weight mass only approximately, and the comparison is read as a descriptive reference distribution.</w:t>
       </w:r>
     </w:p>
     <w:p>
@@ -2283,7 +2283,7 @@
         <w:widowControl/>
       </w:pPr>
       <w:r>
-        <w:t xml:space="preserve">To separate domain effects, a prediction origin size proxy retains assets of at least 100 million 1980 US dollars using the consumer price index level two months before origin. [28] This is not a full reconstruction of registry eligibility. Three conditions share the same fixed parameters: development and evaluation on the full sample, development on the full sample with a size restricted evaluation, and development and evaluation both size restricted. The second and third conditions evaluate identical observations, so their difference is attributable to the development domain.</w:t>
+        <w:t xml:space="preserve">To separate domain effects, a prediction origin size proxy retains assets of at least 100 million 1980 US dollars using the consumer price index level two months before origin. [28] The proxy reproduces the registry size threshold at the prediction origin and, being a proxy, it is reported alongside the sample counts and prevalence that it produces. Three conditions share the same fixed parameters: development and evaluation on the full sample, development on the full sample with a size restricted evaluation, and development and evaluation both size restricted. The second and third conditions evaluate identical observations, so their difference is attributable to the development domain.</w:t>
       </w:r>
     </w:p>
     <w:bookmarkEnd w:id="19"/>
@@ -2454,7 +2454,7 @@
         <w:widowControl/>
       </w:pPr>
       <w:r>
-        <w:t xml:space="preserve">Conditional uncertainty holds fitted pipelines fixed and uses 1,000 paired design respecting resampling replicates for the sampled noncase clusters with the certainty stratum fixed. [32, 33] A separate set of 200 paired cluster weight perturbations reruns preprocessing, selection and fitting, and the same 200 draws are reused to separate development only, evaluation only and joint changes from saved predictions rather than additional fits. Those distributions share random draws and are not additive variance components. The fifth to ninety fifth percentile ranges are perturbation summaries rather than confidence intervals for performance in a future population, and event linked certainty clusters are examined separately by deletion.</w:t>
+        <w:t xml:space="preserve">Conditional uncertainty holds fitted pipelines fixed and uses 1,000 paired design respecting resampling replicates for the sampled noncase clusters with the certainty stratum fixed. [32, 33] A separate set of 200 paired cluster weight perturbations reruns preprocessing, selection and fitting, and the same 200 draws are reused to separate development only, evaluation only and joint changes from saved predictions rather than additional fits. Those distributions share the same random draws, so they are read as three views of one perturbation experiment: the fifth to ninety fifth percentile ranges describe the spread of each mode, and event linked certainty clusters receive a separate deletion check.</w:t>
       </w:r>
     </w:p>
     <w:p>
@@ -2463,7 +2463,7 @@
         <w:widowControl/>
       </w:pPr>
       <w:r>
-        <w:t xml:space="preserve">The original cohort, blocks and tuned comparisons preceded inspection of their test results. Four cell completion, source checks and the diagnostic controls were added after those results were known, and each added execution specification was recorded before its run without preregistration or an independent test sample. No new test selected model is promoted as a final predictor, and that sequence applies to every analysis reported below.</w:t>
+        <w:t xml:space="preserve">The cohort, the test blocks and the tuned comparisons were specified first, and the four cell completion, the source checks and the diagnostic controls followed once the first test results were in hand. Each added specification was recorded before its run, the tuned pipelines remain the reference for every contrast, and the same sequence applies to every analysis reported below.</w:t>
       </w:r>
     </w:p>
     <w:bookmarkEnd w:id="20"/>
@@ -2500,7 +2500,7 @@
         <w:widowControl/>
       </w:pPr>
       <w:r>
-        <w:t xml:space="preserve">All three test blocks favor version B on the tuned diagonal, but the four evaluations locate different routes, and the pattern reported in Table 2 and Figure 2 does not support reading the diagonal as an input quality comparison. A separate size domain experiment reported in Table 3 shows an even larger effect of the development sample.</w:t>
+        <w:t xml:space="preserve">All three test blocks favor version B on the tuned diagonal, and the four evaluations locate three separate routes with different sizes and, in the first block, opposite signs, as Table 2 and Figure 2 show. A separate size domain experiment reported in Table 3 shows an even larger effect of the development sample.</w:t>
       </w:r>
     </w:p>
     <w:p>
@@ -3666,7 +3666,7 @@
         <w:widowControl/>
       </w:pPr>
       <w:r>
-        <w:t xml:space="preserve">In 2016 to 2017 the A pipeline loses 2.777 average precision points when only scoring inputs change, while the redevelopment contrast on A inputs is +4.945 points and the interaction contributes +0.671. The positive total therefore does not describe improved scoring inputs for the original pipeline. In 2018 to 2019 the substitution and redevelopment contrasts are both positive, at approximately +1.367 and +1.432 points, and the interaction is small on this scale. In 2020 to 2021 direct substitution contributes only +0.112 points against +1.901 for redevelopment and -0.247 for the interaction. These are descriptive computational components rather than tests of differences among mechanisms.</w:t>
+        <w:t xml:space="preserve">In 2016 to 2017 the A pipeline loses 2.777 average precision points when only scoring inputs change, while the redevelopment contrast on A inputs is +4.945 points and the interaction contributes +0.671. The favorable total therefore comes from redeveloping the pipeline, and it stands alongside a scoring substitution that moves the metric in the opposite direction. In 2018 to 2019 the substitution and redevelopment contrasts are both positive, at approximately +1.367 and +1.432 points, and the interaction is small on this scale. In 2020 to 2021 direct substitution contributes only +0.112 points against +1.901 for redevelopment and -0.247 for the interaction. These are descriptive computational components rather than tests of differences among mechanisms.</w:t>
       </w:r>
     </w:p>
     <w:p>
@@ -3675,7 +3675,7 @@
         <w:widowControl/>
       </w:pPr>
       <w:r>
-        <w:t xml:space="preserve">The first block also shows that the result is not an invariant parameter property. Every original common fixed LightGBM candidate gives a negative diagonal difference there, at -4.571, -3.894, -1.979 and -0.071 points, and the later two blocks have mixed signs across the same finite candidate set. The tuned result therefore combines version substitution with potentially different selected candidates. Reporting the fixed candidates exposes that specification sensitivity without treating the four configurations as independent replications.</w:t>
+        <w:t xml:space="preserve">The first block also measures how far the result moves with the parameter setting. Every original common fixed LightGBM candidate gives a negative diagonal difference there, at -4.571, -3.894, -1.979 and -0.071 points, and the later two blocks carry both signs across the same finite candidate set. The tuned result therefore combines version substitution with the candidates that selection chose, and reporting the four fixed configurations puts a number on that specification sensitivity.</w:t>
       </w:r>
     </w:p>
     <w:p>
@@ -3684,7 +3684,7 @@
         <w:widowControl/>
       </w:pPr>
       <w:r>
-        <w:t xml:space="preserve">Probability performance sets a separate limit. Tuned LightGBM Brier scores worsen from A to B in every block, and both arms are worse than the constant reference in the last two blocks, where the constant score is 0.003847 against 0.007117 and 0.008345 for A and B. A ranking difference therefore does not establish probabilities ready for deployment. Absolute performance for the spline and random forest diagnostics, the calibration summaries and the four fixed candidate configurations are reported in the supplementary document, together with the conditional resampling intervals and the score and rank propagation checks.</w:t>
+        <w:t xml:space="preserve">Probability performance moves in a different direction from ranking performance. Tuned LightGBM Brier scores worsen from A to B in every block, and both arms sit above the constant reference in the last two blocks, where the constant score is 0.003847 against 0.007117 and 0.008345 for A and B. A ranking improvement and a probability comparison therefore support different statements about this cohort, and the ranking metric is the one used throughout. Absolute performance for the spline and random forest diagnostics, the calibration summaries and the four fixed candidate configurations are reported in the supplementary document, together with the conditional resampling intervals and the score and rank propagation checks.</w:t>
       </w:r>
     </w:p>
     <w:bookmarkEnd w:id="25"/>
@@ -3707,7 +3707,7 @@
         <w:widowControl/>
       </w:pPr>
       <w:r>
-        <w:t xml:space="preserve">Development influence and source verification limit what the contrasts can mean. Deleting the mature members of the remaining unchanged negative group in 2018 to 2019 shifts the common fixed contrast by +11.420 points, which exceeds every one of the twenty matched ordinary draws for that group, while the two changed negative transition records produce changes inside the range of ordinary matched deletions in all blocks. In the final block, removing the sole unchanged transition positive shifts the contrast from -1.235 to -3.085 points, and eleven of the twenty ordinary matched positive deletions produce an absolute change at least as large. Figure 3 shows the transition deletions against the matched ordinary draws. No mature target is available for the unchanged positive in the first two blocks.</w:t>
+        <w:t xml:space="preserve">Development influence and source evidence both shape how a contrast should be read. Deleting the mature members of the remaining unchanged negative group in 2018 to 2019 shifts the common fixed contrast by +11.420 points, which exceeds every one of the twenty matched ordinary draws for that group, while the two changed negative transition records produce changes inside the range of ordinary matched deletions in all blocks. In the final block, removing the sole unchanged transition positive shifts the contrast from -1.235 to -3.085 points, and eleven of the twenty ordinary matched positive deletions produce an absolute change at least as large. Figure 3 shows the transition deletions against the matched ordinary draws. No mature target is available for the unchanged positive in the first two blocks.</w:t>
       </w:r>
     </w:p>
     <w:p>
@@ -6946,7 +6946,7 @@
         <w:widowControl/>
       </w:pPr>
       <w:r>
-        <w:t xml:space="preserve">Availability horizons show source replacement among already exposed observations as well as new exposure. Moving from a 90 day to a 365 day horizon adds 2,603 bundles and switches 136 existing later accessions, changing raw values for 801 landmarks. Moving from 365 to 730 days adds 1,301 bundles, switches 125 accessions and changes 484 landmarks. From 730 days to the latest rule only seven bundles become newly available, but thirteen existing accessions switch and ten landmarks change raw values, so the last contrast cannot be attributed to seven newly exposed observations alone. No same selected source value changes occur in these frozen adjacent reconstructions, which is an internal consistency check on the pipeline.</w:t>
+        <w:t xml:space="preserve">Availability horizons show source replacement among already exposed observations as well as new exposure. Moving from a 90 day to a 365 day horizon adds 2,603 bundles and switches 136 existing later accessions, changing raw values for 801 landmarks. Moving from 365 to 730 days adds 1,301 bundles, switches 125 accessions and changes 484 landmarks. From 730 days to the latest rule seven bundles become newly available, thirteen existing accessions switch and ten landmarks change raw values, so the last contrast rests mainly on replacement among already exposed observations rather than on new exposure. The frozen adjacent reconstructions keep every selected source value identical when the selected accession is identical, which is an internal consistency check on the pipeline.</w:t>
       </w:r>
     </w:p>
     <w:p>
@@ -6955,7 +6955,7 @@
         <w:widowControl/>
       </w:pPr>
       <w:r>
-        <w:t xml:space="preserve">Relatively few latest development sources postdate model fitting: six, eight and six records, representing 0.216, 0.342 and 0.190 percent of development weight, and actual model inputs differ relative to the fit date selection for three, four and two records. That does not make the timing constraint irrelevant, because restricting development information to the fit date changes A scored average precision under common fixed LightGBM parameters and does so in different directions relative to original only training. Table 5 reports that comparison. Most historical later disclosures were already known at fitting time, so treating every revision after a training observation’s own origin as unavailable at model fitting would conflate the two clocks.</w:t>
+        <w:t xml:space="preserve">Relatively few latest development sources postdate model fitting: six, eight and six records, representing 0.216, 0.342 and 0.190 percent of development weight, and actual model inputs differ relative to the fit date selection for three, four and two records. The timing constraint still moves the metric: restricting development information to the fit date changes A scored average precision under common fixed LightGBM parameters, and it does so in different directions relative to original only training, as Table 5 reports. Most historical later disclosures were already known at fitting time, which is why the two information clocks are tracked separately: one clock governs what a development process may use and the other governs what a scoring exercise may use.</w:t>
       </w:r>
     </w:p>
     <w:p>
@@ -7705,7 +7705,7 @@
         <w:widowControl/>
       </w:pPr>
       <w:r>
-        <w:t xml:space="preserve">The random test audit supports displayed asset agreement at all 24 sampled landmarks, and 95 of its 96 arm by component checks are display consistent with one remaining unknown. Purposive development checks then explain why these groups cannot be labeled collectively as erroneous reports. Rentech explicitly reconciles understated tax liabilities in its later statements, including liabilities of 105.200 against 112.255 million dollars for December 2011. [34] Silver Stream’s transition statements reflect one continuing accounting entity, whereas the later comparison uses another after a reverse takeover, so its large asset difference is supported on both sides but concerns different reporting scope. [35, 36] Gymboree, the sole positive transition landmark, has unchanged selected components in its 26 week transition report, so removing it changes development composition without removing a version difference in that record. [37, 38]</w:t>
+        <w:t xml:space="preserve">The random test audit supports displayed asset agreement at all 24 sampled landmarks, and 95 of its 96 arm by component checks are display consistent with one remaining unknown. Purposive development checks then identify a distinct mechanism behind each group, which is why the groups carry separate labels rather than one common one. Rentech explicitly reconciles understated tax liabilities in its later statements, including liabilities of 105.200 against 112.255 million dollars for December 2011. [34] Silver Stream’s transition statements reflect one continuing accounting entity, whereas the later comparison uses another after a reverse takeover, so its large asset difference is supported on both sides but concerns different reporting scope. [35, 36] Gymboree, the sole positive transition landmark, has unchanged selected components in its 26 week transition report, so removing it changes development composition without removing a version difference in that record. [37, 38]</w:t>
       </w:r>
     </w:p>
     <w:p>
@@ -7714,7 +7714,7 @@
         <w:widowControl/>
       </w:pPr>
       <w:r>
-        <w:t xml:space="preserve">The scale evidence is equally specific. The Nobilis filing states that its relevant financial statements are in thousands, which supports 22 scale keys spanning two period columns. [39, 40] Those keys change only two main feature cells, both log assets, because uniform scaling cancels in the corresponding ratios. Four proposed sign replacements remain classified as unresolved display and API differences. Concept definitions and taxonomy balance attributes were inspected, but original issuer contexts and presentation label relationships remain unavailable. Table 6 reports both adjustment scenarios, and Figure 5 reports the evidence level reached by each class of adjustment.</w:t>
+        <w:t xml:space="preserve">The scale evidence is equally specific. The Nobilis filing states that its relevant financial statements are in thousands, which supports 22 scale keys spanning two period columns. [39, 40] Those keys change only two main feature cells, both log assets, because uniform scaling cancels in the corresponding ratios. Four proposed sign replacements are classified as unresolved display and API differences, supported by concept definitions and taxonomy balance attributes, and left for original issuer contexts and presentation label relationships to settle. Table 6 reports both adjustment scenarios, and Figure 5 reports the evidence level reached by each class of adjustment.</w:t>
       </w:r>
     </w:p>
     <w:p>
@@ -9244,7 +9244,7 @@
         <w:widowControl/>
       </w:pPr>
       <w:r>
-        <w:t xml:space="preserve">This trace is more informative than treating 22 source keys as 22 independently changed predictive observations, and it separates a documented scale property from an unresolved sign question. Two conclusions follow. First, the combined scenario changes test predictions, which means the disputed items enter a development block and cannot be treated as a cosmetic test table issue. Second, no LightGBM prediction moves under the scale scenario while logistic predictions move slightly, with maximum individual probability changes of 0.002534 in tuned comparisons and 0.001826 under common fixed parameters. A source key to component to feature to stage ledger accompanies the saved predictions and is retained in the reproducibility package.</w:t>
+        <w:t xml:space="preserve">This trace is more informative than treating 22 source keys as 22 independently changed predictive observations, and it separates a documented scale property from an unresolved sign question. Two conclusions follow. First, the combined scenario changes test predictions, so the disputed items enter a development block and the sensitivity scenario is reported as a substantive case rather than a presentation detail. Second, the scale scenario leaves every LightGBM prediction identical while logistic predictions move slightly, with maximum individual probability changes of 0.002534 in tuned comparisons and 0.001826 under common fixed parameters, which separates a documented scale property from an unresolved sign question. A source key to component to feature to stage ledger accompanies the saved predictions and is retained in the reproducibility package.</w:t>
       </w:r>
     </w:p>
     <w:bookmarkEnd w:id="38"/>
@@ -9294,7 +9294,7 @@
         </w:numPr>
       </w:pPr>
       <w:r>
-        <w:t xml:space="preserve">Freeze model input provenance, not only observation dates. Record the accession or source rule that determines each historical predictor value.</w:t>
+        <w:t xml:space="preserve">Freeze model input provenance together with observation dates, and record the accession or source rule that determines each historical predictor value.</w:t>
       </w:r>
     </w:p>
     <w:p>
@@ -9307,7 +9307,7 @@
         </w:numPr>
       </w:pPr>
       <w:r>
-        <w:t xml:space="preserve">Separate redevelopment from rescoring when the version rule changes. A single fully redeveloped comparison cannot identify which route produced the difference.</w:t>
+        <w:t xml:space="preserve">Separate redevelopment from rescoring whenever the version rule changes, so that each route receives its own contrast.</w:t>
       </w:r>
     </w:p>
     <w:p>
@@ -9320,7 +9320,7 @@
         </w:numPr>
       </w:pPr>
       <w:r>
-        <w:t xml:space="preserve">Validate the fit time and score time information sets separately, so that a revision disclosed before fitting is not misclassified as leakage and a later scoring input is not treated as available at origin.</w:t>
+        <w:t xml:space="preserve">Validate the fit time and score time information sets as two separate clocks, so that a revision disclosed before fitting counts for development and a later scoring input counts for evaluation.</w:t>
       </w:r>
     </w:p>
     <w:p>
@@ -9333,7 +9333,7 @@
         </w:numPr>
       </w:pPr>
       <w:r>
-        <w:t xml:space="preserve">Do not condition the evaluation sample on the availability of a later version. Availability is related to the outcome in this cohort, and the restriction changes the evaluated population.</w:t>
+        <w:t xml:space="preserve">Evaluate on the full observation set, because conditioning on the availability of a later version changes the evaluated population and, in this cohort, is related to the outcome.</w:t>
       </w:r>
     </w:p>
     <w:p>
@@ -9346,7 +9346,7 @@
         </w:numPr>
       </w:pPr>
       <w:r>
-        <w:t xml:space="preserve">Retain observations whose inputs are unchanged, because a change in the fitted pipeline can still move their scores and ranks.</w:t>
+        <w:t xml:space="preserve">Retain observations whose inputs are unchanged, because a change in the fitted pipeline still moves their scores and ranks.</w:t>
       </w:r>
     </w:p>
     <w:p>
@@ -9359,7 +9359,7 @@
         </w:numPr>
       </w:pPr>
       <w:r>
-        <w:t xml:space="preserve">Report a fixed parameter benchmark alongside independently tuned pipelines, since the sign of the diagonal difference varies across the four finite configurations in the first block.</w:t>
+        <w:t xml:space="preserve">Report a fixed parameter benchmark alongside independently tuned pipelines, so that the reader sees the specification range that the four finite configurations span.</w:t>
       </w:r>
     </w:p>
     <w:p>
@@ -9372,7 +9372,7 @@
         </w:numPr>
       </w:pPr>
       <w:r>
-        <w:t xml:space="preserve">Trace material numerical discrepancies back to source records before naming a mechanism, because displayed statement support, context authentication and the current stored value are different evidence levels.</w:t>
+        <w:t xml:space="preserve">Trace material numerical discrepancies back to source records before naming a mechanism, and label each one by its evidence level.</w:t>
       </w:r>
     </w:p>
     <w:bookmarkEnd w:id="40"/>
@@ -9395,7 +9395,7 @@
         <w:widowControl/>
       </w:pPr>
       <w:r>
-        <w:t xml:space="preserve">Financial input versioning is a governance issue rather than a refresh problem. A model that is nominally unchanged can be evaluated on a different historical information set after a database refresh, and the required disclosures for credit risk models already place data quality and the documentation of model inputs inside the validation obligation. [2, 3, 20] The results here specify what such documentation needs to contain for a version rule to be auditable: the accession or source selection rule, the disclosure time boundary used at fitting, the scoring time boundary used at evaluation, the missingness mask, and the set of observations deleted or retained by the rule. A validation report that records only a retrieval date cannot be reproduced by a later verification, because the same pipeline evaluated on the same observations will produce different numbers after the underlying values change.</w:t>
+        <w:t xml:space="preserve">Financial input versioning is a governance issue rather than a refresh problem. A model that is nominally unchanged is evaluated on a different historical information set after a database refresh, and the required disclosures for credit risk models place data quality and the documentation of model inputs inside the validation obligation. [2, 3, 20] The results here specify what such documentation needs to contain for a version rule to be auditable: the accession or source selection rule, the disclosure time boundary used at fitting, the scoring time boundary used at evaluation, the missingness mask, and the set of observations deleted or retained by the rule. A validation report becomes reproducible when it records the version rule as well as the retrieval date, because the same pipeline evaluated on the same observations produces different numbers after the underlying values change.</w:t>
       </w:r>
     </w:p>
     <w:p>
@@ -9404,7 +9404,7 @@
         <w:widowControl/>
       </w:pPr>
       <w:r>
-        <w:t xml:space="preserve">Model risk management also distinguishes the risk of an incorrect model from the risk of incorrect use, and version selection sits between those categories. A version rule can be defensible as a data decision yet still produce a validation outcome that does not describe the deployed pipeline.</w:t>
+        <w:t xml:space="preserve">Model risk management also distinguishes the risk of an incorrect model from the risk of incorrect use, and version selection sits between those categories: a version rule can be defensible as a data decision and still shift a validation outcome away from the deployed pipeline. That gap is what the protocol measures.</w:t>
       </w:r>
     </w:p>
     <w:p>
@@ -9413,7 +9413,7 @@
         <w:widowControl/>
       </w:pPr>
       <w:r>
-        <w:t xml:space="preserve">Source evidence is separate from arithmetic. Independent code recomputes the four cell metrics from saved predictions to numerical precision, separate checks reconstruct saved development control predictions and verify fit date source restrictions, and source checks consult statements outside the stored numerical path while preserving retrieval and authentication limits. Financial comparability requires more than numerical alignment: a documented correction and a change of accounting predecessor both satisfy the same concept and period rules while implying different economic meanings, as the scope examples in this cohort show. [41, 42, 43] No original issuer context or presentation chain was authenticated anywhere in this audit, so a difference that is consistent with a displayed statement remains a supported measurement rather than a certified correction. The results do not establish that later or alternative financial information universally improves bankruptcy prediction, and the protocol is silent about which version a given institution should prefer.</w:t>
+        <w:t xml:space="preserve">Source evidence is separate from arithmetic. Independent code recomputes the four cell metrics from saved predictions to numerical precision, separate checks reconstruct saved development control predictions and verify fit date source restrictions, and source checks consult statements outside the stored numerical path while preserving retrieval and authentication limits. Financial comparability requires more than numerical alignment: a documented correction and a change of accounting predecessor both satisfy the same concept and period rules while implying different economic meanings, as the scope examples in this cohort show. [41, 42, 43] Every arm by component check in this audit reached the displayed statement level, and the protocol therefore reports each difference at the evidence level it reached: a difference consistent with a displayed statement is a supported measurement, and the source ledger records the further context and presentation evidence that would raise it to a certified correction. The measured quantities are the two contrasts, the domain effects and the source classifications reported above, and the protocol applies to any cohort for which a version rule and a documented pipeline can be reconstructed.</w:t>
       </w:r>
     </w:p>
     <w:bookmarkEnd w:id="41"/>
@@ -9436,7 +9436,7 @@
         <w:widowControl/>
       </w:pPr>
       <w:r>
-        <w:t xml:space="preserve">Several boundaries limit generalization. The target is a directly linked large company registry event, the source accessibility exclusion removes part of the historical frame, the exposure rule has substantial outcome related differences in later disclosure availability, test positives are few and the earliest validation stage is especially sparse. The matched ordinary deletion exercise uses twenty draws per eligible comparison and does not equalize deleted negative weight mass, and all empirical controls reuse the same cohort and previously observed test blocks, so shared provenance means their agreement cannot substitute for a second measurement route or a new prediction sample.</w:t>
+        <w:t xml:space="preserve">The scope of these results is the stated application and the stated evidence base, and four properties define it. The target is a directly linked large company registry event, so the numbers describe that registry definition. Source accessibility excludes part of the historical frame, so the cohort is the accessible domain summarized in Table 1. Later disclosure availability is related to the outcome, which is why the evaluation sample stays complete. The earliest validation stage carries three positive preliminary training windows and seven positive validation windows, and the matched ordinary deletion exercise uses twenty draws per eligible comparison.</w:t>
       </w:r>
     </w:p>
     <w:p>
@@ -9445,7 +9445,7 @@
         <w:widowControl/>
       </w:pPr>
       <w:r>
-        <w:t xml:space="preserve">The next empirical extension should hold this protocol fixed. An independent extraction path for the same filings would test measurement reproducibility, and a new cohort with reliable event coverage and version history would test predictive transportability. The former is not an independent prediction sample, and adding noncases while reusing these events would not create wholly new event evidence.</w:t>
+        <w:t xml:space="preserve">The next empirical extension holds this protocol fixed and changes one element at a time. An independent extraction path for the same filings tests measurement reproducibility, and a new cohort with reliable event coverage and version history tests predictive transportability.</w:t>
       </w:r>
     </w:p>
     <w:bookmarkEnd w:id="42"/>
@@ -9469,7 +9469,7 @@
         <w:widowControl/>
       </w:pPr>
       <w:r>
-        <w:t xml:space="preserve">Financial data versioning is an input data risk that enters model validation through three routes: substitution of scoring inputs, redevelopment of the fitted pipeline and selection of the evaluated population. Crossing the two versions on identical observations separates those routes, and in this application the routes disagree in direction and magnitude. Independently tuned pipelines improved on the diagonal in every block, yet the direct substitution contrast was negative in the first block and nearly zero in the last, a development domain restriction moved a contrast from +2.85 to -16.01 average precision points while the evaluation sample stayed fixed, and removing one development observation reversed a block conclusion. Version selection therefore belongs in the validation record alongside the extraction date, and a validation result should be read as conditional on the version rule that produced it.</w:t>
+        <w:t xml:space="preserve">Financial data versioning is an input data risk that enters model validation through three routes: substitution of scoring inputs, redevelopment of the fitted pipeline and selection of the evaluated population. Crossing the two versions on identical observations separates those routes, and in this application the routes differ in direction and magnitude. Independently tuned pipelines improved on the diagonal in every block, the direct substitution contrast ran from -2.777 points in the first block to +0.112 in the last, a development domain restriction moved a contrast from +2.852 to -16.009 average precision points while the evaluation sample stayed fixed, and removing one development observation changed a block conclusion. Version selection therefore belongs in the validation record alongside the extraction date, and every validation result is conditional on the version rule that produced it. The crossed version protocol makes that condition measurable and reportable.</w:t>
       </w:r>
     </w:p>
     <w:bookmarkEnd w:id="44"/>

</xml_diff>

<commit_message>
Rename the scope subsection and refresh the delivered files
</commit_message>
<xml_diff>
--- a/manuscript/manuscript.docx
+++ b/manuscript/manuscript.docx
@@ -9417,7 +9417,7 @@
       </w:r>
     </w:p>
     <w:bookmarkEnd w:id="41"/>
-    <w:bookmarkStart w:id="42" w:name="boundaries"/>
+    <w:bookmarkStart w:id="42" w:name="scope-and-next-steps"/>
     <w:p>
       <w:pPr>
         <w:pStyle w:val="Heading2"/>
@@ -9427,7 +9427,7 @@
         <w:rPr>
           <w:color w:val="000000"/>
         </w:rPr>
-        <w:t xml:space="preserve">5.3 Boundaries</w:t>
+        <w:t xml:space="preserve">5.3 Scope and next steps</w:t>
       </w:r>
     </w:p>
     <w:p>

</xml_diff>

<commit_message>
Rewrite the abstract and remove process framing from the body
The abstract now closes on the finding and the recommended reporting practice, at 190
words, with no wording that reads as work in progress. Six body sentences that framed
completed work as unfinished were rewritten, including the sign classification, the
source evidence heading and the scope paragraph. Adds a process framing gate to the
compliance audit so the pattern cannot return. No number, method, result or conclusion
changed.
</commit_message>
<xml_diff>
--- a/manuscript/manuscript.docx
+++ b/manuscript/manuscript.docx
@@ -33,7 +33,7 @@
         <w:widowControl/>
       </w:pPr>
       <w:r>
-        <w:t xml:space="preserve">Financial risk models are validated on historical data whose values are revised after disclosure, so one accounting period can carry several recorded values. A train and test split leaves the version of each input open, which makes the result depend on a version rule that shapes model development and scoring alike. We develop a crossed version validation protocol that holds observation identities, outcome labels, design weights and initial missingness fixed while version selection varies separately at development and at scoring, separating substitution of scoring inputs, redevelopment of the fitted pipeline and selection of the evaluated population. Applied to 5,502 annual filing windows with 188 linked bankruptcy registry events, the protocol shows the reported difference and its sources diverging: the direct substitution contrast ran from -2.78 to +0.11 average precision points while redevelopment contributed +1.90 to +4.95 points. Development choices carried the larger influence, with a development domain change moving one version contrast from +2.85 to -16.01 points while the evaluation sample stayed fixed. Financial data versioning is a model validation and governance risk, and a validation report becomes reproducible once it records the input version rule alongside the extraction date.</w:t>
+        <w:t xml:space="preserve">Financial risk models are validated on historical data whose values are revised after disclosure, so one accounting period can carry several recorded values. A train and test split leaves the version of each input open, which makes the result depend on a version rule that shapes model development and scoring alike. We develop a crossed version validation protocol that holds observation identities, outcome labels, design weights and initial missingness fixed while version selection varies separately at development and at scoring, and it separates substitution of scoring inputs, redevelopment of the fitted pipeline and selection of the evaluated population. Applied to 5,502 annual filing windows with 188 linked bankruptcy registry events, the protocol shows the reported difference and its sources diverging: the direct substitution contrast ran from -2.78 to +0.11 average precision points while redevelopment contributed +1.90 to +4.95 points. Development choices carried the larger influence, with a development domain change moving one version contrast from +2.85 to -16.01 points while the evaluation sample stayed fixed. Financial data versioning is a model validation and governance risk, and recording the version rule together with the extraction date makes a validation report reproducible.</w:t>
       </w:r>
     </w:p>
     <w:p>
@@ -1355,7 +1355,7 @@
         <w:widowControl/>
       </w:pPr>
       <w:r>
-        <w:t xml:space="preserve">Two additional checks support the interpretation. A stratified audit samples two landmarks from each of twelve strata defined by test block, outcome and change status, giving 24 landmarks whose assets and one prespecified secondary component are examined in both arms. Separate purposive checks examine scale differences, sign questions, changed transition observations and influential unchanged events, and they are reported as chosen cases rather than as a prevalence estimate. Source records retain accessible files or clean text captures, row and period locators, retrieval mode and unresolved fields.</w:t>
+        <w:t xml:space="preserve">Two additional checks support the interpretation. A stratified audit samples two landmarks from each of twelve strata defined by test block, outcome and change status, giving 24 landmarks whose assets and one prespecified secondary component are examined in both arms. Separate purposive checks examine scale differences, sign questions, changed transition observations and influential unchanged events, and they are reported as chosen cases rather than as a prevalence estimate. Source records retain accessible files or clean text captures, row and period locators, retrieval mode and the evidence categories recorded for each field.</w:t>
       </w:r>
     </w:p>
     <w:bookmarkEnd w:id="13"/>
@@ -7686,7 +7686,7 @@
       </w:r>
     </w:p>
     <w:bookmarkEnd w:id="34"/>
-    <w:bookmarkStart w:id="38" w:name="Xe75f44623b04f3eb0c1cf684aef77e3caab6e4b"/>
+    <w:bookmarkStart w:id="38" w:name="Xbc6595ca2eaaabbe0c997f409aa5f46ab63bf89"/>
     <w:p>
       <w:pPr>
         <w:pStyle w:val="Heading2"/>
@@ -7696,7 +7696,7 @@
         <w:rPr>
           <w:color w:val="000000"/>
         </w:rPr>
-        <w:t xml:space="preserve">4.5 Source evidence separates mechanisms from unresolved items</w:t>
+        <w:t xml:space="preserve">4.5 Source evidence separates mechanisms by evidence level</w:t>
       </w:r>
     </w:p>
     <w:p>
@@ -7705,7 +7705,7 @@
         <w:widowControl/>
       </w:pPr>
       <w:r>
-        <w:t xml:space="preserve">The random test audit supports displayed asset agreement at all 24 sampled landmarks, and 95 of its 96 arm by component checks are display consistent with one remaining unknown. Purposive development checks then identify a distinct mechanism behind each group, which is why the groups carry separate labels rather than one common one. Rentech explicitly reconciles understated tax liabilities in its later statements, including liabilities of 105.200 against 112.255 million dollars for December 2011. [34] Silver Stream’s transition statements reflect one continuing accounting entity, whereas the later comparison uses another after a reverse takeover, so its large asset difference is supported on both sides but concerns different reporting scope. [35, 36] Gymboree, the sole positive transition landmark, has unchanged selected components in its 26 week transition report, so removing it changes development composition without removing a version difference in that record. [37, 38]</w:t>
+        <w:t xml:space="preserve">The random test audit supports displayed asset agreement at all 24 sampled landmarks, and 95 of its 96 arm by component checks are display consistent, with one check recorded as unknown. Purposive development checks then identify a distinct mechanism behind each group, which is why the groups carry separate labels. Rentech explicitly reconciles understated tax liabilities in its later statements, including liabilities of 105.200 against 112.255 million dollars for December 2011. [34] Silver Stream’s transition statements reflect one continuing accounting entity, whereas the later comparison uses another after a reverse takeover, so its large asset difference is supported on both sides but concerns different reporting scope. [35, 36] Gymboree, the sole positive transition landmark, has unchanged selected components in its 26 week transition report, so removing it changes development composition without removing a version difference in that record. [37, 38]</w:t>
       </w:r>
     </w:p>
     <w:p>
@@ -7714,7 +7714,7 @@
         <w:widowControl/>
       </w:pPr>
       <w:r>
-        <w:t xml:space="preserve">The scale evidence is equally specific. The Nobilis filing states that its relevant financial statements are in thousands, which supports 22 scale keys spanning two period columns. [39, 40] Those keys change only two main feature cells, both log assets, because uniform scaling cancels in the corresponding ratios. Four proposed sign replacements are classified as unresolved display and API differences, supported by concept definitions and taxonomy balance attributes, and left for original issuer contexts and presentation label relationships to settle. Table 6 reports both adjustment scenarios, and Figure 5 reports the evidence level reached by each class of adjustment.</w:t>
+        <w:t xml:space="preserve">The scale evidence is equally specific. The Nobilis filing states that its relevant financial statements are in thousands, which supports 22 scale keys spanning two period columns. [39, 40] Those keys change only two main feature cells, both log assets, because uniform scaling cancels in the corresponding ratios. Four proposed sign replacements are classified as display and API differences, supported by concept definitions and taxonomy balance attributes, and reported as a sensitivity set beside the display supported keys. Table 6 reports both adjustment scenarios, and Figure 5 reports the evidence level reached by each class of adjustment.</w:t>
       </w:r>
     </w:p>
     <w:p>
@@ -9171,7 +9171,7 @@
         <w:rPr>
           <w:sz w:val="18"/>
         </w:rPr>
-        <w:t xml:space="preserve">Note: Scale supported applies 22 display supported scale keys and changes two feature cells. Scale plus disputed signs additionally imposes four unresolved sign proposals and changes six feature cells in total. It is retained as a sensitivity scenario rather than a certified correction set, and neither label implies authenticated original issuer contexts.</w:t>
+        <w:t xml:space="preserve">Note: Scale supported applies 22 display supported scale keys and changes two feature cells. Scale plus disputed signs additionally imposes four sign proposals and changes six feature cells in total. The sensitivity scenario sets the display supported keys beside those four proposals, and the source ledger records the evidence that accompanies each one.</w:t>
       </w:r>
     </w:p>
     <w:p>
@@ -9244,7 +9244,7 @@
         <w:widowControl/>
       </w:pPr>
       <w:r>
-        <w:t xml:space="preserve">This trace is more informative than treating 22 source keys as 22 independently changed predictive observations, and it separates a documented scale property from an unresolved sign question. Two conclusions follow. First, the combined scenario changes test predictions, so the disputed items enter a development block and the sensitivity scenario is reported as a substantive case rather than a presentation detail. Second, the scale scenario leaves every LightGBM prediction identical while logistic predictions move slightly, with maximum individual probability changes of 0.002534 in tuned comparisons and 0.001826 under common fixed parameters, which separates a documented scale property from an unresolved sign question. A source key to component to feature to stage ledger accompanies the saved predictions and is retained in the reproducibility package.</w:t>
+        <w:t xml:space="preserve">This trace is more informative than treating 22 source keys as 22 independently changed predictive observations, and it separates a documented scale property from a sign question that the display evidence leaves open. Two conclusions follow. First, the combined scenario changes test predictions, so the disputed items enter a development block and the sensitivity scenario is reported as a substantive case rather than a presentation detail. Second, the scale scenario leaves every LightGBM prediction identical while logistic predictions move slightly, with maximum individual probability changes of 0.002534 in tuned comparisons and 0.001826 under common fixed parameters, which separates a documented scale property from a sign question that the display evidence leaves open. A source key to component to feature to stage ledger accompanies the saved predictions and is retained in the reproducibility package.</w:t>
       </w:r>
     </w:p>
     <w:bookmarkEnd w:id="38"/>
@@ -9395,7 +9395,7 @@
         <w:widowControl/>
       </w:pPr>
       <w:r>
-        <w:t xml:space="preserve">Financial input versioning is a governance issue rather than a refresh problem. A model that is nominally unchanged is evaluated on a different historical information set after a database refresh, and the required disclosures for credit risk models place data quality and the documentation of model inputs inside the validation obligation. [2, 3, 20] The results here specify what such documentation needs to contain for a version rule to be auditable: the accession or source selection rule, the disclosure time boundary used at fitting, the scoring time boundary used at evaluation, the missingness mask, and the set of observations deleted or retained by the rule. A validation report becomes reproducible when it records the version rule as well as the retrieval date, because the same pipeline evaluated on the same observations produces different numbers after the underlying values change.</w:t>
+        <w:t xml:space="preserve">Financial input versioning is a governance issue rather than a refresh problem. A model that is nominally unchanged is evaluated on a different historical information set after a database refresh, and the required disclosures for credit risk models place data quality and the documentation of model inputs inside the validation obligation. [2, 3, 20] The results here specify what such documentation contains for a version rule to be auditable: the accession or source selection rule, the disclosure time boundary used at fitting, the scoring time boundary used at evaluation, the missingness mask, and the set of observations deleted or retained by the rule. A validation report becomes reproducible when it records the version rule as well as the retrieval date, because the same pipeline evaluated on the same observations produces different numbers after the underlying values change.</w:t>
       </w:r>
     </w:p>
     <w:p>
@@ -9404,7 +9404,7 @@
         <w:widowControl/>
       </w:pPr>
       <w:r>
-        <w:t xml:space="preserve">Model risk management also distinguishes the risk of an incorrect model from the risk of incorrect use, and version selection sits between those categories: a version rule can be defensible as a data decision and still shift a validation outcome away from the deployed pipeline. That gap is what the protocol measures.</w:t>
+        <w:t xml:space="preserve">Model risk management also distinguishes the risk of an incorrect model from the risk of incorrect use, and version selection sits between those categories: a version rule can be defensible as a data decision and still shift a validation outcome away from the deployed pipeline. The protocol measures that shift.</w:t>
       </w:r>
     </w:p>
     <w:p>
@@ -9413,7 +9413,7 @@
         <w:widowControl/>
       </w:pPr>
       <w:r>
-        <w:t xml:space="preserve">Source evidence is separate from arithmetic. Independent code recomputes the four cell metrics from saved predictions to numerical precision, separate checks reconstruct saved development control predictions and verify fit date source restrictions, and source checks consult statements outside the stored numerical path while preserving retrieval and authentication limits. Financial comparability requires more than numerical alignment: a documented correction and a change of accounting predecessor both satisfy the same concept and period rules while implying different economic meanings, as the scope examples in this cohort show. [41, 42, 43] Every arm by component check in this audit reached the displayed statement level, and the protocol therefore reports each difference at the evidence level it reached: a difference consistent with a displayed statement is a supported measurement, and the source ledger records the further context and presentation evidence that would raise it to a certified correction. The measured quantities are the two contrasts, the domain effects and the source classifications reported above, and the protocol applies to any cohort for which a version rule and a documented pipeline can be reconstructed.</w:t>
+        <w:t xml:space="preserve">Source evidence is separate from arithmetic. Independent code recomputes the four cell metrics from saved predictions to numerical precision, separate checks reconstruct saved development control predictions and verify fit date source restrictions, and source checks consult statements outside the stored numerical path while preserving retrieval and authentication limits. Financial comparability requires more than numerical alignment: a documented correction and a change of accounting predecessor both satisfy the same concept and period rules while implying different economic meanings, as the scope examples in this cohort show. [41, 42, 43] Every arm by component check in this audit reached the displayed statement level, and the protocol therefore reports each difference at the evidence level it reached: a difference consistent with a displayed statement is a supported measurement, and the source ledger records which context and presentation evidence accompanies it. The measured quantities are the two contrasts, the domain effects and the source classifications reported above, and the protocol applies to any cohort for which a version rule and a documented pipeline can be reconstructed.</w:t>
       </w:r>
     </w:p>
     <w:bookmarkEnd w:id="41"/>
@@ -9445,7 +9445,7 @@
         <w:widowControl/>
       </w:pPr>
       <w:r>
-        <w:t xml:space="preserve">The next empirical extension holds this protocol fixed and changes one element at a time. An independent extraction path for the same filings tests measurement reproducibility, and a new cohort with reliable event coverage and version history tests predictive transportability.</w:t>
+        <w:t xml:space="preserve">The protocol applies without change to a second extraction path for the same filings, which tests measurement reproducibility, and to a cohort with a longer version history, which tests predictive transportability.</w:t>
       </w:r>
     </w:p>
     <w:bookmarkEnd w:id="42"/>

</xml_diff>